<commit_message>
Dokumenty pro kancelář: aktualizace podle pravidel cloudu, souhlas klienta, doložky do licenční smlouvy, příručky zavedení a provozu
</commit_message>
<xml_diff>
--- a/docs/kancelar/1_Zpracovatelska_smlouva.docx
+++ b/docs/kancelar/1_Zpracovatelska_smlouva.docx
@@ -64,6 +64,37 @@
     </w:p>
     <w:p>
       <w:pPr>
+        <w:pBdr>
+          <w:left w:val="single" w:color="7F7F7F" w:sz="18" w:space="6"/>
+        </w:pBdr>
+        <w:shd w:fill="F2F2F2" w:color="auto" w:val="clear"/>
+        <w:spacing w:after="160" w:before="120"/>
+        <w:ind w:left="120"/>
+      </w:pPr>
+      <w:r>
+        <w:rPr>
+          <w:b/>
+          <w:i/>
+          <w:iCs/>
+          <w:color w:val="444444"/>
+          <w:sz w:val="19"/>
+          <w:szCs w:val="19"/>
+        </w:rPr>
+        <w:t>Aktualizace 27. 10. 2026:</w:t>
+      </w:r>
+      <w:r>
+        <w:rPr>
+          <w:i/>
+          <w:iCs/>
+          <w:color w:val="444444"/>
+          <w:sz w:val="19"/>
+          <w:szCs w:val="19"/>
+        </w:rPr>
+        <w:t xml:space="preserve"> doplněny úrovně podpory (čl. 4), místní IT partner (čl. 2), volitelný cloudový model přes Amazon Bedrock v účtu kanceláře (čl. 6) a pravidla cloudu podle spisu v příloze 1. Souvisí s návrhem „Model dodávky bez přístupu dodavatele k datům“ — pokud kancelář zvolí podporu bez přístupu k datům (úrovně L1–L3), dodavatel zpracovatelem není a tato smlouva slouží jen pro krizový zásah L4.</w:t>
+      </w:r>
+    </w:p>
+    <w:p>
+      <w:pPr>
         <w:pStyle w:val="Heading1"/>
       </w:pPr>
       <w:r>
@@ -159,6 +190,20 @@
       </w:r>
       <w:r>
         <w:t xml:space="preserve"> za účelem plnění hlavní smlouvy a jen v nezbytném rozsahu; k jiným účelům (vlastním, analytickým, k tréninku modelů AI) je nesmí použít.</w:t>
+      </w:r>
+    </w:p>
+    <w:p>
+      <w:pPr>
+        <w:spacing w:after="120"/>
+      </w:pPr>
+      <w:r>
+        <w:t xml:space="preserve">Pokud kancelář pro běžnou správu využívá místního IT partnera (správce sítě a počítačů), uzavírá s ním vlastní smlouvu; IT partner není poddodavatelem dodavatele a dodavatel za jeho činnost neodpovídá. </w:t>
+      </w:r>
+      <w:r>
+        <w:rPr>
+          <w:highlight w:val="yellow"/>
+        </w:rPr>
+        <w:t>[doplnit: název IT partnera, pokud je]</w:t>
       </w:r>
     </w:p>
     <w:p>
@@ -584,7 +629,7 @@
         <w:spacing w:after="60"/>
       </w:pPr>
       <w:r>
-        <w:t xml:space="preserve">Nezapojit dalšího zpracovatele bez předchozího písemného souhlasu kanceláře. Ke dni podpisu dodavatel žádné další zpracovatele nevyužívá.</w:t>
+        <w:t>Nezapojit dalšího zpracovatele bez předchozího písemného souhlasu kanceláře. Ke dni podpisu dodavatel žádné další zpracovatele nevyužívá. Amazon Web Services není dalším zpracovatelem dodavatele: využívá-li kancelář cloudový model, je AWS zpracovatelem přímo kanceláře na základě smlouvy, kterou kancelář s AWS uzavírá (čl. 6).</w:t>
       </w:r>
     </w:p>
     <w:p>
@@ -623,7 +668,43 @@
         <w:spacing w:after="60"/>
       </w:pPr>
       <w:r>
-        <w:t xml:space="preserve">Po skončení poskytování služeb vymazat nebo vrátit všechny osobní údaje (včetně kopií pořízených při diagnostice) podle rozhodnutí kanceláře, pokud předpis neukládá jejich uložení.</w:t>
+        <w:t xml:space="preserve">Poskytovat podporu v úrovních, které vybírá kancelář: </w:t>
+      </w:r>
+      <w:r>
+        <w:rPr>
+          <w:b/>
+        </w:rPr>
+        <w:t>L1</w:t>
+      </w:r>
+      <w:r>
+        <w:t xml:space="preserve"> — rada telefonem nebo e-mailem bez přístupu k datům; </w:t>
+      </w:r>
+      <w:r>
+        <w:rPr>
+          <w:b/>
+        </w:rPr>
+        <w:t>L2</w:t>
+      </w:r>
+      <w:r>
+        <w:t xml:space="preserve"> — diagnostika z technických údajů bez obsahu spisů (verze, stav služeb, chybová hlášení), které kanceláři předá sama; </w:t>
+      </w:r>
+      <w:r>
+        <w:rPr>
+          <w:b/>
+        </w:rPr>
+        <w:t>L3</w:t>
+      </w:r>
+      <w:r>
+        <w:t xml:space="preserve"> — vzdálená relace se sdílením obrazovky, kterou spouští a po celou dobu sleduje pracovník kanceláře; </w:t>
+      </w:r>
+      <w:r>
+        <w:rPr>
+          <w:b/>
+        </w:rPr>
+        <w:t>L4</w:t>
+      </w:r>
+      <w:r>
+        <w:t xml:space="preserve"> — krizový zásah s přístupem k datům (oprava databáze, obnova ze zálohy) jen na písemný pokyn advokáta pro konkrétní zásah. Každý zásah L3 a L4 se zapíše do protokolu podpory (datum, kdo, důvod, rozsah, výsledek).</w:t>
       </w:r>
     </w:p>
     <w:p>
@@ -636,6 +717,19 @@
         <w:spacing w:after="60"/>
       </w:pPr>
       <w:r>
+        <w:t xml:space="preserve">Po skončení poskytování služeb vymazat nebo vrátit všechny osobní údaje (včetně kopií pořízených při diagnostice) podle rozhodnutí kanceláře, pokud předpis neukládá jejich uložení.</w:t>
+      </w:r>
+    </w:p>
+    <w:p>
+      <w:pPr>
+        <w:pStyle w:val="ListParagraph"/>
+        <w:numPr>
+          <w:ilvl w:val="0"/>
+          <w:numId w:val="2"/>
+        </w:numPr>
+        <w:spacing w:after="60"/>
+      </w:pPr>
+      <w:r>
         <w:t xml:space="preserve">Poskytnout kanceláři informace potřebné k doložení splnění povinností a umožnit audity a kontroly prováděné kanceláří nebo pověřeným auditorem.</w:t>
       </w:r>
     </w:p>
@@ -678,7 +772,36 @@
         <w:spacing w:after="120"/>
       </w:pPr>
       <w:r>
-        <w:t xml:space="preserve">Dodavatel osobní údaje mimo Evropský hospodářský prostor nepředává. LexisLocal ve výchozím nastavení zpracovává data jen na zařízení kanceláře; volitelné cloudové služby (např. jazykový model v cloudu, CODEXIS AI) zapíná a smluvně zajišťuje kancelář sama a nejsou předmětem této smlouvy.</w:t>
+        <w:t>Dodavatel osobní údaje mimo Evropský hospodářský prostor nepředává. LexisLocal ve výchozím nastavení zpracovává data jen na zařízení kanceláře. Volitelné cloudové služby zapíná a smluvně zajišťuje kancelář sama a nejsou předmětem zpracování dodavatelem.</w:t>
+      </w:r>
+    </w:p>
+    <w:p>
+      <w:pPr>
+        <w:spacing w:after="120"/>
+      </w:pPr>
+      <w:r>
+        <w:rPr>
+          <w:b/>
+        </w:rPr>
+        <w:t>Cloudový model Claude (volitelně).</w:t>
+      </w:r>
+      <w:r>
+        <w:t xml:space="preserve"> Provozuje se přes službu Amazon Bedrock v účtu AWS, jehož držitelem je kancelář. Zpracování je omezeno na regiony EU (inferenční profil „eu.“ a zámek regionů v oprávněních účtu), ukládání vstupů a záznamů volání modelu je vypnuté. Smlouvu s AWS (podmínky AWS pro zpracování osobních údajů včetně standardních smluvních doložek) uzavírá kancelář. Dodavatel dodává software, který o odeslání dotazu do cloudu rozhoduje podle stupně citlivosti spisu a souhlasu klienta (příloha 1), a šablonu nastavení účtu (oprávnění, rozpočet). Do účtu AWS kanceláře dodavatel přístup nemá; pokud mu ho kancelář pro nastavení dočasně udělí, platí čl. 4 a zápis do protokolu podpory. </w:t>
+      </w:r>
+      <w:r>
+        <w:rPr>
+          <w:highlight w:val="yellow"/>
+        </w:rPr>
+        <w:t>[doplnit: ano/ne — zda kancelář cloud používá]</w:t>
+      </w:r>
+    </w:p>
+    <w:p>
+      <w:pPr>
+        <w:spacing w:after="120"/>
+      </w:pPr>
+      <w:r>
+        <w:rPr/>
+        <w:t>Přímé rozhraní poskytovatelů modelů (Anthropic API, veřejné OpenAI API) je pro údaje klientů v LexisLocalu technicky zablokované. Zbytkové riziko přístupu orgánů USA k datům u poskytovatele cloudu (CLOUD Act) posuzuje kancelář v DPIA.</w:t>
       </w:r>
     </w:p>
     <w:p>
@@ -1275,6 +1398,174 @@
                 <w:szCs w:val="19"/>
               </w:rPr>
               <w:t xml:space="preserve">testování jen na syntetických a veřejných datech; data kanceláře se do vývoje nepřenášejí</w:t>
+            </w:r>
+          </w:p>
+        </w:tc>
+      </w:tr>
+      <w:tr>
+        <w:tc>
+          <w:tcPr>
+            <w:tcW w:type="dxa" w:w="2500"/>
+            <w:tcMar>
+              <w:top w:type="dxa" w:w="60"/>
+              <w:left w:type="dxa" w:w="100"/>
+              <w:bottom w:type="dxa" w:w="60"/>
+              <w:right w:type="dxa" w:w="100"/>
+            </w:tcMar>
+          </w:tcPr>
+          <w:p>
+            <w:r>
+              <w:rPr>
+                <w:sz w:val="19"/>
+                <w:szCs w:val="19"/>
+              </w:rPr>
+              <w:t>Pravidla cloudu podle spisu</w:t>
+            </w:r>
+          </w:p>
+        </w:tc>
+        <w:tc>
+          <w:tcPr>
+            <w:tcW w:type="dxa" w:w="6526"/>
+            <w:tcMar>
+              <w:top w:type="dxa" w:w="60"/>
+              <w:left w:type="dxa" w:w="100"/>
+              <w:bottom w:type="dxa" w:w="60"/>
+              <w:right w:type="dxa" w:w="100"/>
+            </w:tcMar>
+          </w:tcPr>
+          <w:p>
+            <w:r>
+              <w:rPr>
+                <w:sz w:val="19"/>
+                <w:szCs w:val="19"/>
+              </w:rPr>
+              <w:t>každý spis má stupeň citlivosti A–D (výchozí B); A nikdy do cloudu, B jen se souhlasem klienta pro spis, C se souhlasem pro spis nebo rámcovým souhlasem, D veřejné; dotaz nad více spisy se řídí nejcitlivějším; text bez vazby na spis jde jen lokálně; při odepření zpracuje dotaz lokální model</w:t>
+            </w:r>
+          </w:p>
+        </w:tc>
+      </w:tr>
+      <w:tr>
+        <w:tc>
+          <w:tcPr>
+            <w:tcW w:type="dxa" w:w="2500"/>
+            <w:tcMar>
+              <w:top w:type="dxa" w:w="60"/>
+              <w:left w:type="dxa" w:w="100"/>
+              <w:bottom w:type="dxa" w:w="60"/>
+              <w:right w:type="dxa" w:w="100"/>
+            </w:tcMar>
+          </w:tcPr>
+          <w:p>
+            <w:r>
+              <w:rPr>
+                <w:sz w:val="19"/>
+                <w:szCs w:val="19"/>
+              </w:rPr>
+              <w:t>Kdo o cloudu rozhoduje</w:t>
+            </w:r>
+          </w:p>
+        </w:tc>
+        <w:tc>
+          <w:tcPr>
+            <w:tcW w:type="dxa" w:w="6526"/>
+            <w:tcMar>
+              <w:top w:type="dxa" w:w="60"/>
+              <w:left w:type="dxa" w:w="100"/>
+              <w:bottom w:type="dxa" w:w="60"/>
+              <w:right w:type="dxa" w:w="100"/>
+            </w:tcMar>
+          </w:tcPr>
+          <w:p>
+            <w:r>
+              <w:rPr>
+                <w:sz w:val="19"/>
+                <w:szCs w:val="19"/>
+              </w:rPr>
+              <w:t>souhlas klienta zaznamenává a stupeň snižuje jen advokát (snížení s odůvodněním); odvolat souhlas smí každý uživatel se zápisem do spisu; AI agent stupeň ani souhlas nemění; změny se zapisují do deníku spisu a auditu</w:t>
+            </w:r>
+          </w:p>
+        </w:tc>
+      </w:tr>
+      <w:tr>
+        <w:tc>
+          <w:tcPr>
+            <w:tcW w:type="dxa" w:w="2500"/>
+            <w:tcMar>
+              <w:top w:type="dxa" w:w="60"/>
+              <w:left w:type="dxa" w:w="100"/>
+              <w:bottom w:type="dxa" w:w="60"/>
+              <w:right w:type="dxa" w:w="100"/>
+            </w:tcMar>
+          </w:tcPr>
+          <w:p>
+            <w:r>
+              <w:rPr>
+                <w:sz w:val="19"/>
+                <w:szCs w:val="19"/>
+              </w:rPr>
+              <w:t>Záznam o cloudu</w:t>
+            </w:r>
+          </w:p>
+        </w:tc>
+        <w:tc>
+          <w:tcPr>
+            <w:tcW w:type="dxa" w:w="6526"/>
+            <w:tcMar>
+              <w:top w:type="dxa" w:w="60"/>
+              <w:left w:type="dxa" w:w="100"/>
+              <w:bottom w:type="dxa" w:w="60"/>
+              <w:right w:type="dxa" w:w="100"/>
+            </w:tcMar>
+          </w:tcPr>
+          <w:p>
+            <w:r>
+              <w:rPr>
+                <w:sz w:val="19"/>
+                <w:szCs w:val="19"/>
+              </w:rPr>
+              <w:t>každé odeslání i odepření cloudu se zapíše do auditu („Cloud AI“: spisy, model, důvod); odeslání i do deníku spisu</w:t>
+            </w:r>
+          </w:p>
+        </w:tc>
+      </w:tr>
+      <w:tr>
+        <w:tc>
+          <w:tcPr>
+            <w:tcW w:type="dxa" w:w="2500"/>
+            <w:tcMar>
+              <w:top w:type="dxa" w:w="60"/>
+              <w:left w:type="dxa" w:w="100"/>
+              <w:bottom w:type="dxa" w:w="60"/>
+              <w:right w:type="dxa" w:w="100"/>
+            </w:tcMar>
+          </w:tcPr>
+          <w:p>
+            <w:r>
+              <w:rPr>
+                <w:sz w:val="19"/>
+                <w:szCs w:val="19"/>
+              </w:rPr>
+              <w:t>Rozpočet cloudu</w:t>
+            </w:r>
+          </w:p>
+        </w:tc>
+        <w:tc>
+          <w:tcPr>
+            <w:tcW w:type="dxa" w:w="6526"/>
+            <w:tcMar>
+              <w:top w:type="dxa" w:w="60"/>
+              <w:left w:type="dxa" w:w="100"/>
+              <w:bottom w:type="dxa" w:w="60"/>
+              <w:right w:type="dxa" w:w="100"/>
+            </w:tcMar>
+          </w:tcPr>
+          <w:p>
+            <w:r>
+              <w:rPr>
+                <w:sz w:val="19"/>
+                <w:szCs w:val="19"/>
+              </w:rPr>
+              <w:t>odhad nákladů podle tokenů, měsíční rozpočet s upozorněním a tvrdým stropem; denní porovnání s vyúčtováním AWS (jen součty, bez obsahu)</w:t>
             </w:r>
           </w:p>
         </w:tc>

</xml_diff>